<commit_message>
docs: rebrand user guide — new screenshots, rename, error-detail shot
All screenshots recaptured against the live CDN-branded app (fresh test
data, 29–30 Sep IDs). Renamed the guide to "Integration Lite Post-TX
Uploader" per CDN's request, refreshed the cover date, and added a new
error-detail screenshot now that a TEP-errored batch exists, with the
Download XML/JSON buttons referenced from the text.

Co-Authored-By: Claude Fable 5 <noreply@anthropic.com>
Claude-Session: https://claude.ai/code/session_01RVR5rp9UYgcvqoP6Vvrub4
</commit_message>
<xml_diff>
--- a/docs/README_user.docx
+++ b/docs/README_user.docx
@@ -7,13 +7,19 @@
         <w:pStyle w:val="Title"/>
       </w:pPr>
       <w:r>
-        <w:t xml:space="preserve">TEP</w:t>
-      </w:r>
-      <w:r>
-        <w:t xml:space="preserve"> </w:t>
-      </w:r>
-      <w:r>
-        <w:t xml:space="preserve">Data</w:t>
+        <w:t xml:space="preserve">Integration</w:t>
+      </w:r>
+      <w:r>
+        <w:t xml:space="preserve"> </w:t>
+      </w:r>
+      <w:r>
+        <w:t xml:space="preserve">Lite</w:t>
+      </w:r>
+      <w:r>
+        <w:t xml:space="preserve"> </w:t>
+      </w:r>
+      <w:r>
+        <w:t xml:space="preserve">Post-TX</w:t>
       </w:r>
       <w:r>
         <w:t xml:space="preserve"> </w:t>
@@ -70,9 +76,9 @@
       <w:pPr>
         <w:pStyle w:val="Heading1"/>
       </w:pPr>
-      <w:bookmarkStart w:id="20" w:name="what-is-tep-data-uploader"/>
-      <w:r>
-        <w:t xml:space="preserve">What is TEP Data Uploader?</w:t>
+      <w:bookmarkStart w:id="20" w:name="Xfafb26c334aa02f2782db29cf8fbb3e640a9353"/>
+      <w:r>
+        <w:t xml:space="preserve">What is the Integration Lite Post-TX Uploader?</w:t>
       </w:r>
       <w:bookmarkEnd w:id="20"/>
     </w:p>
@@ -81,19 +87,7 @@
         <w:pStyle w:val="FirstParagraph"/>
       </w:pPr>
       <w:r>
-        <w:t xml:space="preserve">TEP Data Uploader is a tool that takes publication data from a spreadsheet and sends it to TEP (The Everyone Project) for processing. It converts each row of your spreadsheet into the format TEP expects and uploads it automatically. In your browser it appears as</w:t>
-      </w:r>
-      <w:r>
-        <w:t xml:space="preserve"> </w:t>
-      </w:r>
-      <w:r>
-        <w:rPr>
-          <w:b/>
-        </w:rPr>
-        <w:t xml:space="preserve">Diamond Integration-Lite Post-TX Uploader</w:t>
-      </w:r>
-      <w:r>
-        <w:t xml:space="preserve">.</w:t>
+        <w:t xml:space="preserve">The Integration Lite Post-TX Uploader is a tool that takes publication data from a spreadsheet and sends it to TEP (The Everyone Project) for processing. It converts each row of your spreadsheet into the format TEP expects and uploads it automatically.</w:t>
       </w:r>
     </w:p>
     <w:p>
@@ -215,7 +209,7 @@
       <w:r>
         <w:drawing>
           <wp:inline>
-            <wp:extent cx="5334000" cy="2663598"/>
+            <wp:extent cx="5334000" cy="2758480"/>
             <wp:effectExtent b="0" l="0" r="0" t="0"/>
             <wp:docPr descr="The Settings panel (example values shown)" title="" id="1" name="Picture"/>
             <a:graphic>
@@ -236,7 +230,7 @@
                   <pic:spPr bwMode="auto">
                     <a:xfrm>
                       <a:off x="0" y="0"/>
-                      <a:ext cx="5334000" cy="2663598"/>
+                      <a:ext cx="5334000" cy="2758480"/>
                     </a:xfrm>
                     <a:prstGeom prst="rect">
                       <a:avLst/>
@@ -306,6 +300,374 @@
         <w:pStyle w:val="BodyText"/>
       </w:pPr>
       <w:r>
+        <w:t xml:space="preserve">Once you have entered the details, click</w:t>
+      </w:r>
+      <w:r>
+        <w:t xml:space="preserve"> </w:t>
+      </w:r>
+      <w:r>
+        <w:rPr>
+          <w:b/>
+        </w:rPr>
+        <w:t xml:space="preserve">Test connection</w:t>
+      </w:r>
+      <w:r>
+        <w:t xml:space="preserve">. The app checks each part of the setup in turn — your network, the bucket name and region, the access key, the secret, and finally that the key is allowed to write to the bucket — without uploading anything. If something is wrong, the message tells you which part it is and what to do about it:</w:t>
+      </w:r>
+    </w:p>
+    <w:tbl>
+      <w:tblPr>
+        <w:tblStyle w:val="Table"/>
+        <w:tblW w:type="pct" w:w="5000.0"/>
+        <w:tblLook w:firstRow="1"/>
+      </w:tblPr>
+      <w:tblGrid>
+        <w:gridCol w:w="2640"/>
+        <w:gridCol w:w="2640"/>
+        <w:gridCol w:w="2640"/>
+      </w:tblGrid>
+      <w:tr>
+        <w:trPr>
+          <w:cnfStyle w:firstRow="1"/>
+        </w:trPr>
+        <w:tc>
+          <w:tcPr>
+            <w:tcBorders>
+              <w:bottom w:val="single"/>
+            </w:tcBorders>
+            <w:vAlign w:val="bottom"/>
+          </w:tcPr>
+          <w:p>
+            <w:pPr>
+              <w:pStyle w:val="Compact"/>
+              <w:jc w:val="left"/>
+            </w:pPr>
+            <w:r>
+              <w:t xml:space="preserve">Message</w:t>
+            </w:r>
+          </w:p>
+        </w:tc>
+        <w:tc>
+          <w:tcPr>
+            <w:tcBorders>
+              <w:bottom w:val="single"/>
+            </w:tcBorders>
+            <w:vAlign w:val="bottom"/>
+          </w:tcPr>
+          <w:p>
+            <w:pPr>
+              <w:pStyle w:val="Compact"/>
+              <w:jc w:val="left"/>
+            </w:pPr>
+            <w:r>
+              <w:t xml:space="preserve">What it means</w:t>
+            </w:r>
+          </w:p>
+        </w:tc>
+        <w:tc>
+          <w:tcPr>
+            <w:tcBorders>
+              <w:bottom w:val="single"/>
+            </w:tcBorders>
+            <w:vAlign w:val="bottom"/>
+          </w:tcPr>
+          <w:p>
+            <w:pPr>
+              <w:pStyle w:val="Compact"/>
+              <w:jc w:val="left"/>
+            </w:pPr>
+            <w:r>
+              <w:t xml:space="preserve">What to do</w:t>
+            </w:r>
+          </w:p>
+        </w:tc>
+      </w:tr>
+      <w:tr>
+        <w:tc>
+          <w:p>
+            <w:pPr>
+              <w:pStyle w:val="Compact"/>
+              <w:jc w:val="left"/>
+            </w:pPr>
+            <w:r>
+              <w:t xml:space="preserve">Some connection details are missing / doesn’t look right</w:t>
+            </w:r>
+          </w:p>
+        </w:tc>
+        <w:tc>
+          <w:p>
+            <w:pPr>
+              <w:pStyle w:val="Compact"/>
+              <w:jc w:val="left"/>
+            </w:pPr>
+            <w:r>
+              <w:t xml:space="preserve">A field is empty, has stray spaces, or is the wrong shape</w:t>
+            </w:r>
+          </w:p>
+        </w:tc>
+        <w:tc>
+          <w:p>
+            <w:pPr>
+              <w:pStyle w:val="Compact"/>
+              <w:jc w:val="left"/>
+            </w:pPr>
+            <w:r>
+              <w:t xml:space="preserve">Re-copy the value from what TEP sent you</w:t>
+            </w:r>
+          </w:p>
+        </w:tc>
+      </w:tr>
+      <w:tr>
+        <w:tc>
+          <w:p>
+            <w:pPr>
+              <w:pStyle w:val="Compact"/>
+              <w:jc w:val="left"/>
+            </w:pPr>
+            <w:r>
+              <w:t xml:space="preserve">Your network or browser is blocking Amazon S3</w:t>
+            </w:r>
+          </w:p>
+        </w:tc>
+        <w:tc>
+          <w:p>
+            <w:pPr>
+              <w:pStyle w:val="Compact"/>
+              <w:jc w:val="left"/>
+            </w:pPr>
+            <w:r>
+              <w:t xml:space="preserve">This computer cannot reach amazonaws.com at all</w:t>
+            </w:r>
+          </w:p>
+        </w:tc>
+        <w:tc>
+          <w:p>
+            <w:pPr>
+              <w:pStyle w:val="Compact"/>
+              <w:jc w:val="left"/>
+            </w:pPr>
+            <w:r>
+              <w:t xml:space="preserve">Try another network, disable ad-blocker extensions, or ask your IT team</w:t>
+            </w:r>
+          </w:p>
+        </w:tc>
+      </w:tr>
+      <w:tr>
+        <w:tc>
+          <w:p>
+            <w:pPr>
+              <w:pStyle w:val="Compact"/>
+              <w:jc w:val="left"/>
+            </w:pPr>
+            <w:r>
+              <w:t xml:space="preserve">Amazon S3 is reachable, but the bucket could not be contacted</w:t>
+            </w:r>
+          </w:p>
+        </w:tc>
+        <w:tc>
+          <w:p>
+            <w:pPr>
+              <w:pStyle w:val="Compact"/>
+              <w:jc w:val="left"/>
+            </w:pPr>
+            <w:r>
+              <w:t xml:space="preserve">The bucket name or region does not match what TEP sent</w:t>
+            </w:r>
+          </w:p>
+        </w:tc>
+        <w:tc>
+          <w:p>
+            <w:pPr>
+              <w:pStyle w:val="Compact"/>
+              <w:jc w:val="left"/>
+            </w:pPr>
+            <w:r>
+              <w:t xml:space="preserve">Check both carefully; if they are right, contact support</w:t>
+            </w:r>
+          </w:p>
+        </w:tc>
+      </w:tr>
+      <w:tr>
+        <w:tc>
+          <w:p>
+            <w:pPr>
+              <w:pStyle w:val="Compact"/>
+              <w:jc w:val="left"/>
+            </w:pPr>
+            <w:r>
+              <w:t xml:space="preserve">Access key ID not recognised</w:t>
+            </w:r>
+          </w:p>
+        </w:tc>
+        <w:tc>
+          <w:p>
+            <w:pPr>
+              <w:pStyle w:val="Compact"/>
+              <w:jc w:val="left"/>
+            </w:pPr>
+            <w:r>
+              <w:t xml:space="preserve">The key has been mistyped, rotated or deactivated</w:t>
+            </w:r>
+          </w:p>
+        </w:tc>
+        <w:tc>
+          <w:p>
+            <w:pPr>
+              <w:pStyle w:val="Compact"/>
+              <w:jc w:val="left"/>
+            </w:pPr>
+            <w:r>
+              <w:t xml:space="preserve">Enter the current key, or ask TEP for a new one</w:t>
+            </w:r>
+          </w:p>
+        </w:tc>
+      </w:tr>
+      <w:tr>
+        <w:tc>
+          <w:p>
+            <w:pPr>
+              <w:pStyle w:val="Compact"/>
+              <w:jc w:val="left"/>
+            </w:pPr>
+            <w:r>
+              <w:t xml:space="preserve">Secret access key doesn’t match the key ID</w:t>
+            </w:r>
+          </w:p>
+        </w:tc>
+        <w:tc>
+          <w:p>
+            <w:pPr>
+              <w:pStyle w:val="Compact"/>
+              <w:jc w:val="left"/>
+            </w:pPr>
+            <w:r>
+              <w:t xml:space="preserve">The key ID is right but the secret is not the one that goes with it</w:t>
+            </w:r>
+          </w:p>
+        </w:tc>
+        <w:tc>
+          <w:p>
+            <w:pPr>
+              <w:pStyle w:val="Compact"/>
+              <w:jc w:val="left"/>
+            </w:pPr>
+            <w:r>
+              <w:t xml:space="preserve">Re-enter the secret</w:t>
+            </w:r>
+          </w:p>
+        </w:tc>
+      </w:tr>
+      <w:tr>
+        <w:tc>
+          <w:p>
+            <w:pPr>
+              <w:pStyle w:val="Compact"/>
+              <w:jc w:val="left"/>
+            </w:pPr>
+            <w:r>
+              <w:t xml:space="preserve">Your computer’s clock is wrong</w:t>
+            </w:r>
+          </w:p>
+        </w:tc>
+        <w:tc>
+          <w:p>
+            <w:pPr>
+              <w:pStyle w:val="Compact"/>
+              <w:jc w:val="left"/>
+            </w:pPr>
+            <w:r>
+              <w:t xml:space="preserve">AWS rejects requests from computers more than 15 minutes out</w:t>
+            </w:r>
+          </w:p>
+        </w:tc>
+        <w:tc>
+          <w:p>
+            <w:pPr>
+              <w:pStyle w:val="Compact"/>
+              <w:jc w:val="left"/>
+            </w:pPr>
+            <w:r>
+              <w:t xml:space="preserve">Correct the date and time</w:t>
+            </w:r>
+          </w:p>
+        </w:tc>
+      </w:tr>
+      <w:tr>
+        <w:tc>
+          <w:p>
+            <w:pPr>
+              <w:pStyle w:val="Compact"/>
+              <w:jc w:val="left"/>
+            </w:pPr>
+            <w:r>
+              <w:t xml:space="preserve">Keys accepted, but they cannot read the bucket</w:t>
+            </w:r>
+          </w:p>
+        </w:tc>
+        <w:tc>
+          <w:p>
+            <w:pPr>
+              <w:pStyle w:val="Compact"/>
+              <w:jc w:val="left"/>
+            </w:pPr>
+            <w:r>
+              <w:t xml:space="preserve">Uploads will work, but duplicate detection and Error Review will not</w:t>
+            </w:r>
+          </w:p>
+        </w:tc>
+        <w:tc>
+          <w:p>
+            <w:pPr>
+              <w:pStyle w:val="Compact"/>
+              <w:jc w:val="left"/>
+            </w:pPr>
+            <w:r>
+              <w:t xml:space="preserve">Contact support</w:t>
+            </w:r>
+          </w:p>
+        </w:tc>
+      </w:tr>
+      <w:tr>
+        <w:tc>
+          <w:p>
+            <w:pPr>
+              <w:pStyle w:val="Compact"/>
+              <w:jc w:val="left"/>
+            </w:pPr>
+            <w:r>
+              <w:t xml:space="preserve">Everything looks OK at your end, but there appears to be a problem with the TEP bucket</w:t>
+            </w:r>
+          </w:p>
+        </w:tc>
+        <w:tc>
+          <w:p>
+            <w:pPr>
+              <w:pStyle w:val="Compact"/>
+              <w:jc w:val="left"/>
+            </w:pPr>
+            <w:r>
+              <w:t xml:space="preserve">Your details are all correct; the bucket itself is refusing writes</w:t>
+            </w:r>
+          </w:p>
+        </w:tc>
+        <w:tc>
+          <w:p>
+            <w:pPr>
+              <w:pStyle w:val="Compact"/>
+              <w:jc w:val="left"/>
+            </w:pPr>
+            <w:r>
+              <w:t xml:space="preserve">Contact support and quote the reference shown</w:t>
+            </w:r>
+          </w:p>
+        </w:tc>
+      </w:tr>
+    </w:tbl>
+    <w:p>
+      <w:pPr>
+        <w:pStyle w:val="BodyText"/>
+      </w:pPr>
+      <w:r>
         <w:t xml:space="preserve">If the app detects that settings are missing when you start an upload, it will prompt you to enter them.</w:t>
       </w:r>
     </w:p>
@@ -349,7 +711,7 @@
       <w:r>
         <w:drawing>
           <wp:inline>
-            <wp:extent cx="5334000" cy="2646208"/>
+            <wp:extent cx="5334000" cy="2515705"/>
             <wp:effectExtent b="0" l="0" r="0" t="0"/>
             <wp:docPr descr="A test spreadsheet in Google Sheets, using the standard column headings" title="" id="1" name="Picture"/>
             <a:graphic>
@@ -370,7 +732,7 @@
                   <pic:spPr bwMode="auto">
                     <a:xfrm>
                       <a:off x="0" y="0"/>
-                      <a:ext cx="5334000" cy="2646208"/>
+                      <a:ext cx="5334000" cy="2515705"/>
                     </a:xfrm>
                     <a:prstGeom prst="rect">
                       <a:avLst/>
@@ -935,7 +1297,7 @@
       <w:r>
         <w:drawing>
           <wp:inline>
-            <wp:extent cx="5334000" cy="1564821"/>
+            <wp:extent cx="5334000" cy="1653680"/>
             <wp:effectExtent b="0" l="0" r="0" t="0"/>
             <wp:docPr descr="Step 1 — Select File" title="" id="1" name="Picture"/>
             <a:graphic>
@@ -956,7 +1318,7 @@
                   <pic:spPr bwMode="auto">
                     <a:xfrm>
                       <a:off x="0" y="0"/>
-                      <a:ext cx="5334000" cy="1564821"/>
+                      <a:ext cx="5334000" cy="1653680"/>
                     </a:xfrm>
                     <a:prstGeom prst="rect">
                       <a:avLst/>
@@ -1030,7 +1392,7 @@
       <w:r>
         <w:drawing>
           <wp:inline>
-            <wp:extent cx="5334000" cy="2041071"/>
+            <wp:extent cx="5334000" cy="1653680"/>
             <wp:effectExtent b="0" l="0" r="0" t="0"/>
             <wp:docPr descr="File chosen, ready to continue" title="" id="1" name="Picture"/>
             <a:graphic>
@@ -1051,7 +1413,7 @@
                   <pic:spPr bwMode="auto">
                     <a:xfrm>
                       <a:off x="0" y="0"/>
-                      <a:ext cx="5334000" cy="2041071"/>
+                      <a:ext cx="5334000" cy="1653680"/>
                     </a:xfrm>
                     <a:prstGeom prst="rect">
                       <a:avLst/>
@@ -1093,7 +1455,7 @@
       <w:r>
         <w:drawing>
           <wp:inline>
-            <wp:extent cx="5334000" cy="2041071"/>
+            <wp:extent cx="5334000" cy="1653680"/>
             <wp:effectExtent b="0" l="0" r="0" t="0"/>
             <wp:docPr descr="With “Skip column review” ticked, a fully matched file goes straight to validation" title="" id="1" name="Picture"/>
             <a:graphic>
@@ -1114,7 +1476,7 @@
                   <pic:spPr bwMode="auto">
                     <a:xfrm>
                       <a:off x="0" y="0"/>
-                      <a:ext cx="5334000" cy="2041071"/>
+                      <a:ext cx="5334000" cy="1653680"/>
                     </a:xfrm>
                     <a:prstGeom prst="rect">
                       <a:avLst/>
@@ -1225,7 +1587,7 @@
       <w:r>
         <w:drawing>
           <wp:inline>
-            <wp:extent cx="5334000" cy="2663598"/>
+            <wp:extent cx="5334000" cy="2758480"/>
             <wp:effectExtent b="0" l="0" r="0" t="0"/>
             <wp:docPr descr="Map Columns — every column matched automatically (green ticks)" title="" id="1" name="Picture"/>
             <a:graphic>
@@ -1246,7 +1608,7 @@
                   <pic:spPr bwMode="auto">
                     <a:xfrm>
                       <a:off x="0" y="0"/>
-                      <a:ext cx="5334000" cy="2663598"/>
+                      <a:ext cx="5334000" cy="2758480"/>
                     </a:xfrm>
                     <a:prstGeom prst="rect">
                       <a:avLst/>
@@ -1373,7 +1735,7 @@
       <w:r>
         <w:drawing>
           <wp:inline>
-            <wp:extent cx="5334000" cy="2551339"/>
+            <wp:extent cx="5334000" cy="2638852"/>
             <wp:effectExtent b="0" l="0" r="0" t="0"/>
             <wp:docPr descr="Optional fields with no matching column are marked “ignored”" title="" id="1" name="Picture"/>
             <a:graphic>
@@ -1394,7 +1756,7 @@
                   <pic:spPr bwMode="auto">
                     <a:xfrm>
                       <a:off x="0" y="0"/>
-                      <a:ext cx="5334000" cy="2551339"/>
+                      <a:ext cx="5334000" cy="2638852"/>
                     </a:xfrm>
                     <a:prstGeom prst="rect">
                       <a:avLst/>
@@ -1636,7 +1998,7 @@
       <w:r>
         <w:drawing>
           <wp:inline>
-            <wp:extent cx="5334000" cy="1666875"/>
+            <wp:extent cx="5334000" cy="1337018"/>
             <wp:effectExtent b="0" l="0" r="0" t="0"/>
             <wp:docPr descr="Validation Report — one row failed" title="" id="1" name="Picture"/>
             <a:graphic>
@@ -1657,7 +2019,7 @@
                   <pic:spPr bwMode="auto">
                     <a:xfrm>
                       <a:off x="0" y="0"/>
-                      <a:ext cx="5334000" cy="1666875"/>
+                      <a:ext cx="5334000" cy="1337018"/>
                     </a:xfrm>
                     <a:prstGeom prst="rect">
                       <a:avLst/>
@@ -1699,7 +2061,7 @@
       <w:r>
         <w:drawing>
           <wp:inline>
-            <wp:extent cx="5334000" cy="2663598"/>
+            <wp:extent cx="5334000" cy="2758480"/>
             <wp:effectExtent b="0" l="0" r="0" t="0"/>
             <wp:docPr descr="Expanded view of the failing row — the invalid value and the reason" title="" id="1" name="Picture"/>
             <a:graphic>
@@ -1720,7 +2082,7 @@
                   <pic:spPr bwMode="auto">
                     <a:xfrm>
                       <a:off x="0" y="0"/>
-                      <a:ext cx="5334000" cy="2663598"/>
+                      <a:ext cx="5334000" cy="2758480"/>
                     </a:xfrm>
                     <a:prstGeom prst="rect">
                       <a:avLst/>
@@ -1788,7 +2150,7 @@
       <w:r>
         <w:drawing>
           <wp:inline>
-            <wp:extent cx="5334000" cy="1224642"/>
+            <wp:extent cx="5334000" cy="985171"/>
             <wp:effectExtent b="0" l="0" r="0" t="0"/>
             <wp:docPr descr="Ready to upload — nothing is sent until you click the button" title="" id="1" name="Picture"/>
             <a:graphic>
@@ -1809,7 +2171,7 @@
                   <pic:spPr bwMode="auto">
                     <a:xfrm>
                       <a:off x="0" y="0"/>
-                      <a:ext cx="5334000" cy="1224642"/>
+                      <a:ext cx="5334000" cy="985171"/>
                     </a:xfrm>
                     <a:prstGeom prst="rect">
                       <a:avLst/>
@@ -1853,7 +2215,7 @@
         <w:t xml:space="preserve">Upload</w:t>
       </w:r>
       <w:r>
-        <w:t xml:space="preserve">, the app will process each valid row of your spreadsheet and upload it. A</w:t>
+        <w:t xml:space="preserve">, the app first runs the same connection test as the Settings panel. If it fails, nothing is uploaded and you will see the same specific message, with buttons to open Settings or try again. If it passes, the app will process each valid row of your spreadsheet and upload it. A</w:t>
       </w:r>
       <w:r>
         <w:t xml:space="preserve"> </w:t>
@@ -1878,7 +2240,7 @@
       <w:r>
         <w:drawing>
           <wp:inline>
-            <wp:extent cx="5334000" cy="1462767"/>
+            <wp:extent cx="5334000" cy="1178687"/>
             <wp:effectExtent b="0" l="0" r="0" t="0"/>
             <wp:docPr descr="Uploading, with running totals and progress" title="" id="1" name="Picture"/>
             <a:graphic>
@@ -1899,7 +2261,7 @@
                   <pic:spPr bwMode="auto">
                     <a:xfrm>
                       <a:off x="0" y="0"/>
-                      <a:ext cx="5334000" cy="1462767"/>
+                      <a:ext cx="5334000" cy="1178687"/>
                     </a:xfrm>
                     <a:prstGeom prst="rect">
                       <a:avLst/>
@@ -1939,7 +2301,7 @@
         <w:pStyle w:val="BodyText"/>
       </w:pPr>
       <w:r>
-        <w:t xml:space="preserve">If an upload fails for any reason, the app will stop and show you the record that failed. Any rows that were uploaded before the failure are safe and do not need to be re-uploaded.</w:t>
+        <w:t xml:space="preserve">If an upload fails part-way through, the app will stop and show you the record that failed, together with a plain-English explanation of why (for example, that the connection to Amazon S3 was lost). Any rows that were uploaded before the failure are safe and do not need to be re-uploaded.</w:t>
       </w:r>
     </w:p>
     <w:p>
@@ -1967,7 +2329,7 @@
       <w:r>
         <w:drawing>
           <wp:inline>
-            <wp:extent cx="5334000" cy="1598839"/>
+            <wp:extent cx="5334000" cy="1284241"/>
             <wp:effectExtent b="0" l="0" r="0" t="0"/>
             <wp:docPr descr="Results — 4 rows uploaded, 1 invalid row skipped" title="" id="1" name="Picture"/>
             <a:graphic>
@@ -1988,7 +2350,7 @@
                   <pic:spPr bwMode="auto">
                     <a:xfrm>
                       <a:off x="0" y="0"/>
-                      <a:ext cx="5334000" cy="1598839"/>
+                      <a:ext cx="5334000" cy="1284241"/>
                     </a:xfrm>
                     <a:prstGeom prst="rect">
                       <a:avLst/>
@@ -2182,7 +2544,7 @@
       <w:r>
         <w:drawing>
           <wp:inline>
-            <wp:extent cx="5334000" cy="1598839"/>
+            <wp:extent cx="5334000" cy="1284241"/>
             <wp:effectExtent b="0" l="0" r="0" t="0"/>
             <wp:docPr descr="Re-uploading the same file — all rows skipped as duplicates" title="" id="1" name="Picture"/>
             <a:graphic>
@@ -2203,7 +2565,7 @@
                   <pic:spPr bwMode="auto">
                     <a:xfrm>
                       <a:off x="0" y="0"/>
-                      <a:ext cx="5334000" cy="1598839"/>
+                      <a:ext cx="5334000" cy="1284241"/>
                     </a:xfrm>
                     <a:prstGeom prst="rect">
                       <a:avLst/>
@@ -2365,7 +2727,7 @@
       <w:r>
         <w:drawing>
           <wp:inline>
-            <wp:extent cx="5334000" cy="1428750"/>
+            <wp:extent cx="5334000" cy="1688865"/>
             <wp:effectExtent b="0" l="0" r="0" t="0"/>
             <wp:docPr descr="Error Review — one line per upload batch" title="" id="1" name="Picture"/>
             <a:graphic>
@@ -2386,7 +2748,7 @@
                   <pic:spPr bwMode="auto">
                     <a:xfrm>
                       <a:off x="0" y="0"/>
-                      <a:ext cx="5334000" cy="1428750"/>
+                      <a:ext cx="5334000" cy="1688865"/>
                     </a:xfrm>
                     <a:prstGeom prst="rect">
                       <a:avLst/>
@@ -2688,13 +3050,68 @@
     </w:p>
     <w:p>
       <w:pPr>
+        <w:pStyle w:val="CaptionedFigure"/>
+      </w:pPr>
+      <w:r>
+        <w:drawing>
+          <wp:inline>
+            <wp:extent cx="5334000" cy="1530534"/>
+            <wp:effectExtent b="0" l="0" r="0" t="0"/>
+            <wp:docPr descr="Batch detail — the failed file expanded, with its publication ID and download buttons" title="" id="1" name="Picture"/>
+            <a:graphic>
+              <a:graphicData uri="http://schemas.openxmlformats.org/drawingml/2006/picture">
+                <pic:pic>
+                  <pic:nvPicPr>
+                    <pic:cNvPr descr="images/15-error-detail.jpg" id="0" name="Picture"/>
+                    <pic:cNvPicPr>
+                      <a:picLocks noChangeArrowheads="1" noChangeAspect="1"/>
+                    </pic:cNvPicPr>
+                  </pic:nvPicPr>
+                  <pic:blipFill>
+                    <a:blip r:embed="rId50"/>
+                    <a:stretch>
+                      <a:fillRect/>
+                    </a:stretch>
+                  </pic:blipFill>
+                  <pic:spPr bwMode="auto">
+                    <a:xfrm>
+                      <a:off x="0" y="0"/>
+                      <a:ext cx="5334000" cy="1530534"/>
+                    </a:xfrm>
+                    <a:prstGeom prst="rect">
+                      <a:avLst/>
+                    </a:prstGeom>
+                    <a:noFill/>
+                    <a:ln w="9525">
+                      <a:noFill/>
+                      <a:headEnd/>
+                      <a:tailEnd/>
+                    </a:ln>
+                  </pic:spPr>
+                </pic:pic>
+              </a:graphicData>
+            </a:graphic>
+          </wp:inline>
+        </w:drawing>
+      </w:r>
+    </w:p>
+    <w:p>
+      <w:pPr>
+        <w:pStyle w:val="ImageCaption"/>
+      </w:pPr>
+      <w:r>
+        <w:t xml:space="preserve">Batch detail — the failed file expanded, with its publication ID and download buttons</w:t>
+      </w:r>
+    </w:p>
+    <w:p>
+      <w:pPr>
         <w:pStyle w:val="Heading2"/>
       </w:pPr>
-      <w:bookmarkStart w:id="50" w:name="downloading-files"/>
+      <w:bookmarkStart w:id="51" w:name="downloading-files"/>
       <w:r>
         <w:t xml:space="preserve">Downloading Files</w:t>
       </w:r>
-      <w:bookmarkEnd w:id="50"/>
+      <w:bookmarkEnd w:id="51"/>
     </w:p>
     <w:p>
       <w:pPr>
@@ -2731,18 +3148,48 @@
         <w:t xml:space="preserve"> </w:t>
       </w:r>
       <w:r>
-        <w:t xml:space="preserve">generated by TEP. This is useful for debugging or sharing with support.</w:t>
+        <w:t xml:space="preserve">generated by TEP (the</w:t>
+      </w:r>
+      <w:r>
+        <w:t xml:space="preserve"> </w:t>
+      </w:r>
+      <w:r>
+        <w:rPr>
+          <w:b/>
+        </w:rPr>
+        <w:t xml:space="preserve">Download XML</w:t>
+      </w:r>
+      <w:r>
+        <w:t xml:space="preserve"> </w:t>
+      </w:r>
+      <w:r>
+        <w:t xml:space="preserve">and</w:t>
+      </w:r>
+      <w:r>
+        <w:t xml:space="preserve"> </w:t>
+      </w:r>
+      <w:r>
+        <w:rPr>
+          <w:b/>
+        </w:rPr>
+        <w:t xml:space="preserve">Download JSON</w:t>
+      </w:r>
+      <w:r>
+        <w:t xml:space="preserve"> </w:t>
+      </w:r>
+      <w:r>
+        <w:t xml:space="preserve">buttons in the screenshot above). This is useful for debugging or sharing with support.</w:t>
       </w:r>
     </w:p>
     <w:p>
       <w:pPr>
         <w:pStyle w:val="Heading2"/>
       </w:pPr>
-      <w:bookmarkStart w:id="51" w:name="dismissing-batches"/>
+      <w:bookmarkStart w:id="52" w:name="dismissing-batches"/>
       <w:r>
         <w:t xml:space="preserve">Dismissing Batches</w:t>
       </w:r>
-      <w:bookmarkEnd w:id="51"/>
+      <w:bookmarkEnd w:id="52"/>
     </w:p>
     <w:p>
       <w:pPr>
@@ -2779,11 +3226,11 @@
       <w:pPr>
         <w:pStyle w:val="Heading2"/>
       </w:pPr>
-      <w:bookmarkStart w:id="52" w:name="notes"/>
+      <w:bookmarkStart w:id="53" w:name="notes"/>
       <w:r>
         <w:t xml:space="preserve">Notes</w:t>
       </w:r>
-      <w:bookmarkEnd w:id="52"/>
+      <w:bookmarkEnd w:id="53"/>
     </w:p>
     <w:p>
       <w:pPr>
@@ -2843,11 +3290,11 @@
       <w:pPr>
         <w:pStyle w:val="Heading1"/>
       </w:pPr>
-      <w:bookmarkStart w:id="53" w:name="tips"/>
+      <w:bookmarkStart w:id="54" w:name="tips"/>
       <w:r>
         <w:t xml:space="preserve">Tips</w:t>
       </w:r>
-      <w:bookmarkEnd w:id="53"/>
+      <w:bookmarkEnd w:id="54"/>
     </w:p>
     <w:p>
       <w:pPr>

</xml_diff>

<commit_message>
docs: real TEP error report screenshot in the user guide
Live-verified the XML report pipeline with a deliberately schema-invalid
probe (availabilityMode="live"); the error-detail screenshot now shows
TEP's actual SCHEMA_VALIDATION_EXCEPTION rendered by the app. Rebuilt
PDF and Word editions.

Co-Authored-By: Claude Fable 5 <noreply@anthropic.com>
Claude-Session: https://claude.ai/code/session_01RVR5rp9UYgcvqoP6Vvrub4
</commit_message>
<xml_diff>
--- a/docs/README_user.docx
+++ b/docs/README_user.docx
@@ -2607,7 +2607,7 @@
         <w:pStyle w:val="FirstParagraph"/>
       </w:pPr>
       <w:r>
-        <w:t xml:space="preserve">After you upload data, TEP processes each file asynchronously. If a file is processed successfully, it is moved to a</w:t>
+        <w:t xml:space="preserve">After you upload data, TEP processes each file asynchronously. If a file is processed successfully, a status receipt is written to a</w:t>
       </w:r>
       <w:r>
         <w:t xml:space="preserve"> </w:t>
@@ -2625,7 +2625,7 @@
         <w:t xml:space="preserve"> </w:t>
       </w:r>
       <w:r>
-        <w:t xml:space="preserve">folder. If there is a problem, the file is moved to an</w:t>
+        <w:t xml:space="preserve">folder (the uploaded file itself is removed). If there is a problem, the file is moved to an</w:t>
       </w:r>
       <w:r>
         <w:t xml:space="preserve"> </w:t>
@@ -2643,7 +2643,7 @@
         <w:t xml:space="preserve"> </w:t>
       </w:r>
       <w:r>
-        <w:t xml:space="preserve">folder along with a report describing what went wrong.</w:t>
+        <w:t xml:space="preserve">folder along with an XML error report describing what went wrong.</w:t>
       </w:r>
     </w:p>
     <w:p>
@@ -2968,7 +2968,22 @@
         <w:t xml:space="preserve">”</w:t>
       </w:r>
       <w:r>
-        <w:t xml:space="preserve">)</w:t>
+        <w:t xml:space="preserve">) and TEP’s one-line</w:t>
+      </w:r>
+      <w:r>
+        <w:t xml:space="preserve"> </w:t>
+      </w:r>
+      <w:r>
+        <w:rPr>
+          <w:b/>
+        </w:rPr>
+        <w:t xml:space="preserve">summary</w:t>
+      </w:r>
+      <w:r>
+        <w:t xml:space="preserve"> </w:t>
+      </w:r>
+      <w:r>
+        <w:t xml:space="preserve">of why the file was rejected</w:t>
       </w:r>
     </w:p>
     <w:p>
@@ -3010,7 +3025,37 @@
         <w:t xml:space="preserve"> </w:t>
       </w:r>
       <w:r>
-        <w:t xml:space="preserve">(critical, error, warning)</w:t>
+        <w:t xml:space="preserve">—</w:t>
+      </w:r>
+      <w:r>
+        <w:t xml:space="preserve"> </w:t>
+      </w:r>
+      <w:r>
+        <w:rPr>
+          <w:i/>
+        </w:rPr>
+        <w:t xml:space="preserve">error</w:t>
+      </w:r>
+      <w:r>
+        <w:t xml:space="preserve"> </w:t>
+      </w:r>
+      <w:r>
+        <w:t xml:space="preserve">means the data needs correcting before resubmission;</w:t>
+      </w:r>
+      <w:r>
+        <w:t xml:space="preserve"> </w:t>
+      </w:r>
+      <w:r>
+        <w:rPr>
+          <w:i/>
+        </w:rPr>
+        <w:t xml:space="preserve">critical</w:t>
+      </w:r>
+      <w:r>
+        <w:t xml:space="preserve"> </w:t>
+      </w:r>
+      <w:r>
+        <w:t xml:space="preserve">means processing failed at TEP’s end and the file can be resubmitted unchanged</w:t>
       </w:r>
     </w:p>
     <w:p>
@@ -3037,7 +3082,37 @@
         <w:t xml:space="preserve"> </w:t>
       </w:r>
       <w:r>
-        <w:t xml:space="preserve">for each error</w:t>
+        <w:t xml:space="preserve">for each error, with the</w:t>
+      </w:r>
+      <w:r>
+        <w:t xml:space="preserve"> </w:t>
+      </w:r>
+      <w:r>
+        <w:rPr>
+          <w:b/>
+        </w:rPr>
+        <w:t xml:space="preserve">field</w:t>
+      </w:r>
+      <w:r>
+        <w:t xml:space="preserve"> </w:t>
+      </w:r>
+      <w:r>
+        <w:t xml:space="preserve">and</w:t>
+      </w:r>
+      <w:r>
+        <w:t xml:space="preserve"> </w:t>
+      </w:r>
+      <w:r>
+        <w:rPr>
+          <w:b/>
+        </w:rPr>
+        <w:t xml:space="preserve">line number</w:t>
+      </w:r>
+      <w:r>
+        <w:t xml:space="preserve"> </w:t>
+      </w:r>
+      <w:r>
+        <w:t xml:space="preserve">it concerns where TEP can place it</w:t>
       </w:r>
     </w:p>
     <w:p>
@@ -3055,9 +3130,9 @@
       <w:r>
         <w:drawing>
           <wp:inline>
-            <wp:extent cx="5334000" cy="1530534"/>
+            <wp:extent cx="5334000" cy="1853973"/>
             <wp:effectExtent b="0" l="0" r="0" t="0"/>
-            <wp:docPr descr="Batch detail — the failed file expanded, with its publication ID and download buttons" title="" id="1" name="Picture"/>
+            <wp:docPr descr="Batch detail — the failed file expanded, showing TEP’s error report and the download buttons" title="" id="1" name="Picture"/>
             <a:graphic>
               <a:graphicData uri="http://schemas.openxmlformats.org/drawingml/2006/picture">
                 <pic:pic>
@@ -3076,7 +3151,7 @@
                   <pic:spPr bwMode="auto">
                     <a:xfrm>
                       <a:off x="0" y="0"/>
-                      <a:ext cx="5334000" cy="1530534"/>
+                      <a:ext cx="5334000" cy="1853973"/>
                     </a:xfrm>
                     <a:prstGeom prst="rect">
                       <a:avLst/>
@@ -3100,7 +3175,7 @@
         <w:pStyle w:val="ImageCaption"/>
       </w:pPr>
       <w:r>
-        <w:t xml:space="preserve">Batch detail — the failed file expanded, with its publication ID and download buttons</w:t>
+        <w:t xml:space="preserve">Batch detail — the failed file expanded, showing TEP’s error report and the download buttons</w:t>
       </w:r>
     </w:p>
     <w:p>
@@ -3142,7 +3217,7 @@
         <w:rPr>
           <w:b/>
         </w:rPr>
-        <w:t xml:space="preserve">JSON error report</w:t>
+        <w:t xml:space="preserve">XML error report</w:t>
       </w:r>
       <w:r>
         <w:t xml:space="preserve"> </w:t>
@@ -3172,7 +3247,7 @@
         <w:rPr>
           <w:b/>
         </w:rPr>
-        <w:t xml:space="preserve">Download JSON</w:t>
+        <w:t xml:space="preserve">Download error report</w:t>
       </w:r>
       <w:r>
         <w:t xml:space="preserve"> </w:t>
@@ -3219,7 +3294,43 @@
         <w:pStyle w:val="BodyText"/>
       </w:pPr>
       <w:r>
-        <w:t xml:space="preserve">The actual files remain in the S3 bucket — the dismiss action only hides them from your view. The bucket’s lifecycle policy automatically removes old files after 14 days.</w:t>
+        <w:t xml:space="preserve">The actual files remain in the S3 bucket — the dismiss action only hides them from your view. TEP removes old files from the</w:t>
+      </w:r>
+      <w:r>
+        <w:t xml:space="preserve"> </w:t>
+      </w:r>
+      <w:r>
+        <w:t xml:space="preserve">“</w:t>
+      </w:r>
+      <w:r>
+        <w:t xml:space="preserve">complete</w:t>
+      </w:r>
+      <w:r>
+        <w:t xml:space="preserve">”</w:t>
+      </w:r>
+      <w:r>
+        <w:t xml:space="preserve"> </w:t>
+      </w:r>
+      <w:r>
+        <w:t xml:space="preserve">and</w:t>
+      </w:r>
+      <w:r>
+        <w:t xml:space="preserve"> </w:t>
+      </w:r>
+      <w:r>
+        <w:t xml:space="preserve">“</w:t>
+      </w:r>
+      <w:r>
+        <w:t xml:space="preserve">errors</w:t>
+      </w:r>
+      <w:r>
+        <w:t xml:space="preserve">”</w:t>
+      </w:r>
+      <w:r>
+        <w:t xml:space="preserve"> </w:t>
+      </w:r>
+      <w:r>
+        <w:t xml:space="preserve">folders 7 days after they are created.</w:t>
       </w:r>
     </w:p>
     <w:p>

</xml_diff>